<commit_message>
Anchor the paper in the course material
Adds the four-stage analytical framework taught in the course (the
article, the organisation's response, evaluation against the criteria
of responsibility, empathy, transparency and commitment to a solution,
and an alternative response) to the introduction.

Also brings in two examples from the lectures: the waiting-time gap
between the regular and the supplementary service tracks in the HMOs,
and the recurring defensive-response pattern in which an institution
opens by rejecting the claims instead of addressing the family.

Co-Authored-By: Claude Fable 5 <noreply@anthropic.com>
Claude-Session: https://claude.ai/code/session_01EurAtBet21Q8XjrTTQ1m5w
</commit_message>
<xml_diff>
--- a/עבודה_תקשורת_עיתונות_ומערכת_הבריאות.docx
+++ b/עבודה_תקשורת_עיתונות_ומערכת_הבריאות.docx
@@ -508,6 +508,26 @@
       </w:r>
     </w:p>
     <w:p>
+      <w:pPr>
+        <w:bidi/>
+        <w:spacing w:after="0" w:line="480"/>
+        <w:jc w:val="right"/>
+      </w:pPr>
+      <w:r>
+        <w:rPr>
+          <w:rFonts w:ascii="David" w:cs="David" w:eastAsia="David" w:hAnsi="David"/>
+          <w:b w:val="false"/>
+          <w:bCs w:val="false"/>
+          <w:i w:val="false"/>
+          <w:iCs w:val="false"/>
+          <w:sz w:val="24"/>
+          <w:szCs w:val="24"/>
+          <w:rtl/>
+        </w:rPr>
+        <w:t xml:space="preserve">המסגרת האנליטית שלפיה נבחנות התגובות בעבודה זו היא זו שנלמדה בקורס (רזניק, 2026). היא בוחנת אירוע תקשורתי בארבעה שלבים: מה נטען בכתבה עצמה, כיצד הגיב הארגון הרפואי, האם התגובה עומדת בציפייה הציבורית והמקצועית, ומה היה נוסח התגובה הראוי. ארבעה קריטריונים משמשים להערכת התגובה: לקיחת אחריות במקום גלגולה, אמפתיה כלפי הנפגעים, שקיפות לגבי מה שידוע ומה שנבדק, ומחויבות לפתרון הכוללת צעדים ולוחות זמנים. הדפוס החוזר שהוצג בקורס הוא תגובה שנפתחת בעמדה מתגוננת שנועדה להגן על מוניטין הארגון ולצמצם את חומרת הטענות, במקום להיפתח בהתייחסות אנושית לנפגעים ולכלול בדיקה פנימית, הפקת לקחים ושינוי נהלים.</w:t>
+      </w:r>
+    </w:p>
+    <w:p>
       <w:r>
         <w:br w:type="page"/>
       </w:r>
@@ -1074,6 +1094,26 @@
           <w:szCs w:val="24"/>
           <w:rtl/>
         </w:rPr>
+        <w:t xml:space="preserve">הפער הזה בין הזכאות הכתובה לבין השירות בפועל אינו ייחודי למכשירי שיקום. בקורס הוצגו נתוני זמני המתנה בקופות החולים, ומהם עולה שההמתנה לרופא מומחה ולבדיקות הדמיה במסלול השירות הרגיל נמדדת בחודשים, בעוד שבמסלול השירות המיוחד היא נמדדת בימים או בשבועות (רזניק, 2026). התובנה המשותפת לשני המקרים היא שזכאות פורמלית אינה מבטיחה נגישות, ושמי שידו משגת עשוי לקבל מענה מהיר יותר. הכתבה הנדונה מחריפה את התמונה, משום שהיא עוסקת באוכלוסייה שאין לה מסלול חלופי כלל.</w:t>
+      </w:r>
+    </w:p>
+    <w:p>
+      <w:pPr>
+        <w:bidi/>
+        <w:spacing w:after="0" w:line="480"/>
+        <w:jc w:val="right"/>
+      </w:pPr>
+      <w:r>
+        <w:rPr>
+          <w:rFonts w:ascii="David" w:cs="David" w:eastAsia="David" w:hAnsi="David"/>
+          <w:b w:val="false"/>
+          <w:bCs w:val="false"/>
+          <w:i w:val="false"/>
+          <w:iCs w:val="false"/>
+          <w:sz w:val="24"/>
+          <w:szCs w:val="24"/>
+          <w:rtl/>
+        </w:rPr>
         <w:t xml:space="preserve">מכאן נגזרות כמה תובנות מעשיות. כדאי לברר, מיד עם שינוי מדיניות, מי הכתובת האחראית לאספקה בפועל ולא רק מי אחראי על ההכרה בזכאות. כדאי לתעד כל פנייה, לבקש אישור בכתב על מועד הגשת הבקשה, ולדרוש תשובה מנומקת בכתב במקרה של דחייה או עיכוב. כאשר אין מענה, קיימות כתובות ממוסדות כמו נציבות קבילות הציבור לחוק ביטוח בריאות ממלכתי ומחלקות פניות הציבור בקופות, והשימוש בהן משאיר עקבות.</w:t>
       </w:r>
     </w:p>
@@ -1810,7 +1850,7 @@
           <w:szCs w:val="24"/>
           <w:rtl/>
         </w:rPr>
-        <w:t xml:space="preserve">מה שיוביל בוודאות לתביעה ולפנייה לתקשורת: חומה משפטית, ניסוח מתחמק, עיכוב במסירת הרשומה הרפואית, והבטחה לבדוק בלי תאריך.</w:t>
+        <w:t xml:space="preserve">מה שיוביל בוודאות לתביעה ולפנייה לתקשורת: חומה משפטית, ניסוח מתחמק, עיכוב במסירת הרשומה הרפואית, והבטחה לבדוק בלי תאריך. הדוגמאות שנותחו בקורס מלמדות שזה הדפוס השכיח. תגובות של מוסדות רפואיים לתביעות ולתלונות נוטות להיפתח בדחיית הטענות ובאמירה שהאירוע היה בלתי צפוי ושהטיפול ניתן תוך נקיטת כל אמצעי הזהירות, בלי משפט אחד של צער כלפי המשפחה ובלי מידע על בדיקה פנימית או על שינוי נהלים (רזניק, 2026). ניסוח כזה מגן על עמדת הארגון בהליך המשפטי העתידי, ובד בבד הוא זה שדוחף את המשפחה אל ההליך הזה מלכתחילה.</w:t>
       </w:r>
     </w:p>
     <w:p>

</xml_diff>